<commit_message>
feat: professional math formatting in manuscript — italic Greek, subscripts, superscripts, centered equations
Co-Authored-By: Tatsuki Onishi <bougtoir@gmail.com>
</commit_message>
<xml_diff>
--- a/manuscript/table1_model_metrics.docx
+++ b/manuscript/table1_model_metrics.docx
@@ -278,7 +278,25 @@
                 <w:i w:val="0"/>
                 <w:sz w:val="20"/>
               </w:rPr>
-              <w:t>Constant lag μ*</w:t>
+              <w:t xml:space="preserve">Constant lag </w:t>
+            </w:r>
+            <w:r>
+              <w:rPr>
+                <w:rFonts w:ascii="Times New Roman" w:hAnsi="Times New Roman" w:eastAsia="MS Mincho"/>
+                <w:b w:val="0"/>
+                <w:i/>
+                <w:sz w:val="20"/>
+              </w:rPr>
+              <w:t>μ</w:t>
+            </w:r>
+            <w:r>
+              <w:rPr>
+                <w:rFonts w:ascii="Times New Roman" w:hAnsi="Times New Roman" w:eastAsia="MS Mincho"/>
+                <w:b w:val="0"/>
+                <w:i w:val="0"/>
+                <w:sz w:val="20"/>
+              </w:rPr>
+              <w:t>*</w:t>
             </w:r>
           </w:p>
         </w:tc>
@@ -382,7 +400,61 @@
                 <w:i w:val="0"/>
                 <w:sz w:val="20"/>
               </w:rPr>
-              <w:t>Time-varying lag μ(t) = μ₀ + μ₁(t − t₀)</w:t>
+              <w:t xml:space="preserve">Time-varying lag </w:t>
+            </w:r>
+            <w:r>
+              <w:rPr>
+                <w:rFonts w:ascii="Times New Roman" w:hAnsi="Times New Roman" w:eastAsia="MS Mincho"/>
+                <w:b w:val="0"/>
+                <w:i/>
+                <w:sz w:val="20"/>
+              </w:rPr>
+              <w:t>μ</w:t>
+            </w:r>
+            <w:r>
+              <w:rPr>
+                <w:rFonts w:ascii="Times New Roman" w:hAnsi="Times New Roman" w:eastAsia="MS Mincho"/>
+                <w:b w:val="0"/>
+                <w:i w:val="0"/>
+                <w:sz w:val="20"/>
+              </w:rPr>
+              <w:t xml:space="preserve">(t) = </w:t>
+            </w:r>
+            <w:r>
+              <w:rPr>
+                <w:rFonts w:ascii="Times New Roman" w:hAnsi="Times New Roman" w:eastAsia="MS Mincho"/>
+                <w:b w:val="0"/>
+                <w:i/>
+                <w:sz w:val="20"/>
+              </w:rPr>
+              <w:t>μ</w:t>
+            </w:r>
+            <w:r>
+              <w:rPr>
+                <w:rFonts w:ascii="Times New Roman" w:hAnsi="Times New Roman" w:eastAsia="MS Mincho"/>
+                <w:b w:val="0"/>
+                <w:i w:val="0"/>
+                <w:sz w:val="20"/>
+              </w:rPr>
+              <w:t xml:space="preserve">₀ + </w:t>
+            </w:r>
+            <w:r>
+              <w:rPr>
+                <w:rFonts w:ascii="Times New Roman" w:hAnsi="Times New Roman" w:eastAsia="MS Mincho"/>
+                <w:b w:val="0"/>
+                <w:i/>
+                <w:sz w:val="20"/>
+              </w:rPr>
+              <w:t>μ</w:t>
+            </w:r>
+            <w:r>
+              <w:rPr>
+                <w:rFonts w:ascii="Times New Roman" w:hAnsi="Times New Roman" w:eastAsia="MS Mincho"/>
+                <w:b w:val="0"/>
+                <w:i w:val="0"/>
+                <w:sz w:val="20"/>
+              </w:rPr>
+              <w:t>₁(t − t₀)</w:t>
             </w:r>
           </w:p>
         </w:tc>

</xml_diff>